<commit_message>
penambahan atau pemisah setiap bab
</commit_message>
<xml_diff>
--- a/skripsian.docx
+++ b/skripsian.docx
@@ -4,101 +4,109 @@
   <w:body>
     <w:p>
       <w:pPr>
-        <w:pStyle w:val="Title"/>
-        <w:rPr>
-          <w:b w:val="0"/>
-        </w:rPr>
-      </w:pPr>
-      <w:r>
-        <w:t xml:space="preserve">TULISKAN JUDUL SKRIPSI ANDA DI SINI DENGAN </w:t>
-      </w:r>
-      <w:r>
-        <w:rPr>
-          <w:b w:val="0"/>
-          <w:color w:val="FF0000"/>
-        </w:rPr>
-        <w:t>(font tnr 14 pt bold) semua ditulis dengan huruf kapital, spasi 1.5 rata tengah)</w:t>
-      </w:r>
-    </w:p>
-    <w:p>
-      <w:pPr>
-        <w:spacing w:after="0"/>
+        <w:spacing w:after="0"/>
+        <w:jc w:val="center"/>
         <w:rPr>
           <w:b/>
           <w:sz w:val="28"/>
           <w:szCs w:val="28"/>
         </w:rPr>
       </w:pPr>
-    </w:p>
-    <w:p>
-      <w:pPr>
-        <w:pStyle w:val="Title"/>
-      </w:pPr>
-      <w:r>
-        <w:t>SKRIPSI</w:t>
-      </w:r>
-    </w:p>
-    <w:p>
-      <w:pPr>
-        <w:pBdr>
-          <w:top w:val="nil"/>
-          <w:left w:val="nil"/>
-          <w:bottom w:val="nil"/>
-          <w:right w:val="nil"/>
-          <w:between w:val="nil"/>
-        </w:pBdr>
-        <w:spacing w:after="0"/>
-        <w:jc w:val="center"/>
-        <w:rPr>
-          <w:color w:val="000000"/>
-        </w:rPr>
-      </w:pPr>
-      <w:r>
-        <w:rPr>
-          <w:color w:val="000000"/>
-        </w:rPr>
-        <w:t>Diajukan untuk memenuhi salah satu syarat mencapai derajat Sarjana</w:t>
-      </w:r>
-    </w:p>
-    <w:p>
-      <w:pPr>
-        <w:pBdr>
-          <w:top w:val="nil"/>
-          <w:left w:val="nil"/>
-          <w:bottom w:val="nil"/>
-          <w:right w:val="nil"/>
-          <w:between w:val="nil"/>
-        </w:pBdr>
-        <w:spacing w:after="0"/>
-        <w:jc w:val="center"/>
-        <w:rPr>
-          <w:color w:val="000000"/>
-        </w:rPr>
-      </w:pPr>
-      <w:r>
-        <w:rPr>
-          <w:color w:val="000000"/>
-        </w:rPr>
-        <w:t xml:space="preserve">Program Studi </w:t>
-      </w:r>
-      <w:r>
-        <w:rPr>
-          <w:i/>
-          <w:color w:val="FF0000"/>
-        </w:rPr>
-        <w:t>(Tuliskan Prodi Anda)</w:t>
-      </w:r>
-    </w:p>
-    <w:p>
-      <w:pPr>
-        <w:spacing w:after="0"/>
-        <w:jc w:val="center"/>
+      <w:r>
         <w:rPr>
           <w:b/>
           <w:sz w:val="28"/>
           <w:szCs w:val="28"/>
         </w:rPr>
-      </w:pPr>
+        <w:t>“</w:t>
+      </w:r>
+      <w:r>
+        <w:rPr>
+          <w:b/>
+          <w:sz w:val="28"/>
+          <w:szCs w:val="28"/>
+        </w:rPr>
+        <w:t>Implementasi</w:t>
+      </w:r>
+      <w:r>
+        <w:rPr>
+          <w:b/>
+          <w:sz w:val="28"/>
+          <w:szCs w:val="28"/>
+        </w:rPr>
+        <w:t xml:space="preserve"> Learning to Rank dalam Identifikasi Risiko Transaksi Fraud pada Sistem Keuangan Digital”</w:t>
+      </w:r>
+    </w:p>
+    <w:p>
+      <w:pPr>
+        <w:spacing w:after="0"/>
+        <w:jc w:val="center"/>
+        <w:rPr>
+          <w:b/>
+          <w:sz w:val="28"/>
+          <w:szCs w:val="28"/>
+        </w:rPr>
+      </w:pPr>
+    </w:p>
+    <w:p>
+      <w:pPr>
+        <w:pStyle w:val="Title"/>
+      </w:pPr>
+      <w:r>
+        <w:t>SKRIPSI</w:t>
+      </w:r>
+    </w:p>
+    <w:p>
+      <w:pPr>
+        <w:pBdr>
+          <w:top w:val="nil"/>
+          <w:left w:val="nil"/>
+          <w:bottom w:val="nil"/>
+          <w:right w:val="nil"/>
+          <w:between w:val="nil"/>
+        </w:pBdr>
+        <w:spacing w:after="0"/>
+        <w:jc w:val="center"/>
+        <w:rPr>
+          <w:color w:val="000000"/>
+        </w:rPr>
+      </w:pPr>
+      <w:r>
+        <w:rPr>
+          <w:color w:val="000000"/>
+        </w:rPr>
+        <w:t>Diajukan untuk memenuhi salah satu syarat mencapai derajat Sarjana</w:t>
+      </w:r>
+    </w:p>
+    <w:p>
+      <w:pPr>
+        <w:pBdr>
+          <w:top w:val="nil"/>
+          <w:left w:val="nil"/>
+          <w:bottom w:val="nil"/>
+          <w:right w:val="nil"/>
+          <w:between w:val="nil"/>
+        </w:pBdr>
+        <w:spacing w:after="0"/>
+        <w:jc w:val="center"/>
+        <w:rPr>
+          <w:i/>
+          <w:iCs/>
+          <w:color w:val="000000"/>
+        </w:rPr>
+      </w:pPr>
+      <w:r>
+        <w:rPr>
+          <w:color w:val="000000"/>
+        </w:rPr>
+        <w:t xml:space="preserve">Program Studi </w:t>
+      </w:r>
+      <w:r>
+        <w:rPr>
+          <w:color w:val="000000"/>
+        </w:rPr>
+        <w:t>S1 Informatika</w:t>
+      </w:r>
     </w:p>
     <w:p>
       <w:pPr>
@@ -233,15 +241,7 @@
           <w:b/>
           <w:color w:val="000000"/>
         </w:rPr>
-        <w:t xml:space="preserve">NAMA ANDA </w:t>
-      </w:r>
-      <w:r>
-        <w:rPr>
-          <w:b/>
-          <w:i/>
-          <w:color w:val="FF0000"/>
-        </w:rPr>
-        <w:t>(Huruf Kapital, Times New Roman 12 pt bold)</w:t>
+        <w:t>AZIZI EGATRI MU’THI</w:t>
       </w:r>
     </w:p>
     <w:p>
@@ -265,15 +265,7 @@
           <w:b/>
           <w:color w:val="000000"/>
         </w:rPr>
-        <w:t xml:space="preserve">xx.xx.xxxx </w:t>
-      </w:r>
-      <w:r>
-        <w:rPr>
-          <w:b/>
-          <w:i/>
-          <w:color w:val="FF0000"/>
-        </w:rPr>
-        <w:t>(NIM ANDA, Times New Roman 12 pt bold)</w:t>
+        <w:t>22.11.4800</w:t>
       </w:r>
     </w:p>
     <w:p>
@@ -287,6 +279,18 @@
       </w:pPr>
       <w:r>
         <w:t>Kepada</w:t>
+      </w:r>
+    </w:p>
+    <w:p>
+      <w:pPr>
+        <w:jc w:val="center"/>
+      </w:pPr>
+      <w:r>
+        <w:rPr>
+          <w:b/>
+          <w:bCs/>
+        </w:rPr>
+        <w:t>Dr. Hartatik, S.T., M.Cs.</w:t>
       </w:r>
     </w:p>
     <w:p>
@@ -335,107 +339,10 @@
         </w:sectPr>
       </w:pPr>
       <w:r>
-        <w:t>2022</w:t>
-      </w:r>
-    </w:p>
-    <w:p>
-      <w:pPr>
-        <w:pStyle w:val="Title"/>
-        <w:rPr>
-          <w:color w:val="FF0000"/>
-        </w:rPr>
-      </w:pPr>
-      <w:r>
-        <w:lastRenderedPageBreak/>
-        <w:t xml:space="preserve">TULISKAN JUDUL SKRIPSI ANDA DI SINI DENGAN </w:t>
-      </w:r>
-      <w:r>
-        <w:rPr>
-          <w:i/>
-          <w:color w:val="FF0000"/>
-        </w:rPr>
-        <w:t>(Font TNR 14 pt Bold)</w:t>
-      </w:r>
-      <w:r>
-        <w:rPr>
-          <w:color w:val="FF0000"/>
-        </w:rPr>
-        <w:t xml:space="preserve"> SEMUA DITULIS DENGAN HURUF KAPITAL, SPASI 1.5  RATA TENGAH</w:t>
-      </w:r>
-    </w:p>
-    <w:p>
-      <w:pPr>
-        <w:pStyle w:val="Heading1"/>
-        <w:rPr>
-          <w:color w:val="FFFFFF"/>
-        </w:rPr>
-      </w:pPr>
-      <w:bookmarkStart w:id="0" w:name="_heading=h.z337ya" w:colFirst="0" w:colLast="0"/>
-      <w:bookmarkEnd w:id="0"/>
-      <w:r>
-        <w:rPr>
-          <w:color w:val="FFFFFF"/>
-        </w:rPr>
-        <w:t>HALAMAN JUDUL</w:t>
-      </w:r>
-    </w:p>
-    <w:p>
-      <w:pPr>
-        <w:pStyle w:val="Title"/>
-      </w:pPr>
-      <w:r>
-        <w:t>SKRIPSI</w:t>
-      </w:r>
-    </w:p>
-    <w:p>
-      <w:pPr>
-        <w:pBdr>
-          <w:top w:val="nil"/>
-          <w:left w:val="nil"/>
-          <w:bottom w:val="nil"/>
-          <w:right w:val="nil"/>
-          <w:between w:val="nil"/>
-        </w:pBdr>
-        <w:spacing w:after="0"/>
-        <w:jc w:val="center"/>
-        <w:rPr>
-          <w:color w:val="000000"/>
-        </w:rPr>
-      </w:pPr>
-      <w:r>
-        <w:rPr>
-          <w:color w:val="000000"/>
-        </w:rPr>
-        <w:t>untuk memenuhi salah satu syarat mencapai derajat Sarjana</w:t>
-      </w:r>
-    </w:p>
-    <w:p>
-      <w:pPr>
-        <w:pBdr>
-          <w:top w:val="nil"/>
-          <w:left w:val="nil"/>
-          <w:bottom w:val="nil"/>
-          <w:right w:val="nil"/>
-          <w:between w:val="nil"/>
-        </w:pBdr>
-        <w:spacing w:after="0"/>
-        <w:jc w:val="center"/>
-        <w:rPr>
-          <w:color w:val="000000"/>
-        </w:rPr>
-      </w:pPr>
-      <w:r>
-        <w:rPr>
-          <w:color w:val="000000"/>
-        </w:rPr>
-        <w:t xml:space="preserve">Program Studi </w:t>
-      </w:r>
-      <w:r>
-        <w:rPr>
-          <w:i/>
-          <w:color w:val="000000"/>
-        </w:rPr>
-        <w:t>(Tuliskan Prodi Anda)</w:t>
+        <w:t>202</w:t>
+      </w:r>
+      <w:r>
+        <w:t>6</w:t>
       </w:r>
     </w:p>
     <w:p>
@@ -448,22 +355,111 @@
           <w:szCs w:val="28"/>
         </w:rPr>
       </w:pPr>
-    </w:p>
-    <w:p>
-      <w:pPr>
+      <w:r>
+        <w:rPr>
+          <w:b/>
+          <w:sz w:val="28"/>
+          <w:szCs w:val="28"/>
+        </w:rPr>
+        <w:lastRenderedPageBreak/>
+        <w:t>“</w:t>
+      </w:r>
+      <w:r>
+        <w:rPr>
+          <w:b/>
+          <w:sz w:val="28"/>
+          <w:szCs w:val="28"/>
+        </w:rPr>
+        <w:t>Implementasi</w:t>
+      </w:r>
+      <w:r>
+        <w:rPr>
+          <w:b/>
+          <w:sz w:val="28"/>
+          <w:szCs w:val="28"/>
+        </w:rPr>
+        <w:t xml:space="preserve"> Learning to Rank dalam Identifikasi Risiko Transaksi Fraud pada Sistem Keuangan Digital”</w:t>
+      </w:r>
+    </w:p>
+    <w:p>
+      <w:pPr>
+        <w:spacing w:after="0"/>
+        <w:rPr>
+          <w:b/>
+          <w:sz w:val="28"/>
+          <w:szCs w:val="28"/>
+        </w:rPr>
+      </w:pPr>
+    </w:p>
+    <w:p>
+      <w:pPr>
+        <w:pStyle w:val="Title"/>
+      </w:pPr>
+      <w:r>
+        <w:t>SKRIPSI</w:t>
+      </w:r>
+    </w:p>
+    <w:p>
+      <w:pPr>
+        <w:pBdr>
+          <w:top w:val="nil"/>
+          <w:left w:val="nil"/>
+          <w:bottom w:val="nil"/>
+          <w:right w:val="nil"/>
+          <w:between w:val="nil"/>
+        </w:pBdr>
         <w:spacing w:after="0"/>
         <w:jc w:val="center"/>
         <w:rPr>
-          <w:b/>
-        </w:rPr>
-      </w:pPr>
-    </w:p>
-    <w:p>
-      <w:pPr>
+          <w:color w:val="000000"/>
+        </w:rPr>
+      </w:pPr>
+      <w:r>
+        <w:rPr>
+          <w:color w:val="000000"/>
+        </w:rPr>
+        <w:t>Diajukan untuk memenuhi salah satu syarat mencapai derajat Sarjana</w:t>
+      </w:r>
+    </w:p>
+    <w:p>
+      <w:pPr>
+        <w:pBdr>
+          <w:top w:val="nil"/>
+          <w:left w:val="nil"/>
+          <w:bottom w:val="nil"/>
+          <w:right w:val="nil"/>
+          <w:between w:val="nil"/>
+        </w:pBdr>
         <w:spacing w:after="0"/>
         <w:jc w:val="center"/>
         <w:rPr>
           <w:b/>
+          <w:sz w:val="28"/>
+          <w:szCs w:val="28"/>
+        </w:rPr>
+      </w:pPr>
+      <w:r>
+        <w:rPr>
+          <w:color w:val="000000"/>
+        </w:rPr>
+        <w:t>Program Studi S1 Informatika</w:t>
+      </w:r>
+    </w:p>
+    <w:p>
+      <w:pPr>
+        <w:spacing w:after="0"/>
+        <w:jc w:val="center"/>
+        <w:rPr>
+          <w:b/>
+        </w:rPr>
+      </w:pPr>
+    </w:p>
+    <w:p>
+      <w:pPr>
+        <w:spacing w:after="0"/>
+        <w:jc w:val="center"/>
+        <w:rPr>
+          <w:b/>
         </w:rPr>
       </w:pPr>
       <w:r>
@@ -472,7 +468,7 @@
           <w:noProof/>
         </w:rPr>
         <w:drawing>
-          <wp:inline distT="0" distB="0" distL="0" distR="0" wp14:anchorId="4F060E39" wp14:editId="1ACE735B">
+          <wp:inline distT="0" distB="0" distL="0" distR="0" wp14:anchorId="4F060E39" wp14:editId="36CF54E7">
             <wp:extent cx="1981200" cy="1973580"/>
             <wp:effectExtent l="0" t="0" r="0" b="0"/>
             <wp:docPr id="2" name="image2.png"/>
@@ -582,15 +578,7 @@
           <w:b/>
           <w:color w:val="000000"/>
         </w:rPr>
-        <w:t xml:space="preserve">NAMA ANDA </w:t>
-      </w:r>
-      <w:r>
-        <w:rPr>
-          <w:b/>
-          <w:i/>
-          <w:color w:val="000000"/>
-        </w:rPr>
-        <w:t>(Huruf Kapital, Times New Roman 12 pt bold)</w:t>
+        <w:t>AZIZI EGATRI MU’THI</w:t>
       </w:r>
     </w:p>
     <w:p>
@@ -614,15 +602,7 @@
           <w:b/>
           <w:color w:val="000000"/>
         </w:rPr>
-        <w:t xml:space="preserve">xx.xx.xxxx </w:t>
-      </w:r>
-      <w:r>
-        <w:rPr>
-          <w:b/>
-          <w:i/>
-          <w:color w:val="000000"/>
-        </w:rPr>
-        <w:t>(NIM ANDA, Times New Roman 12 pt bold)</w:t>
+        <w:t>22.11.4800</w:t>
       </w:r>
     </w:p>
     <w:p>
@@ -642,6 +622,18 @@
       <w:pPr>
         <w:jc w:val="center"/>
       </w:pPr>
+      <w:r>
+        <w:rPr>
+          <w:b/>
+          <w:bCs/>
+        </w:rPr>
+        <w:t>Dr. Hartatik, S.T., M.Cs.</w:t>
+      </w:r>
+    </w:p>
+    <w:p>
+      <w:pPr>
+        <w:jc w:val="center"/>
+      </w:pPr>
     </w:p>
     <w:p>
       <w:pPr>
@@ -671,18 +663,21 @@
       <w:pPr>
         <w:pStyle w:val="Title"/>
       </w:pPr>
-      <w:bookmarkStart w:id="1" w:name="_heading=h.gjdgxs" w:colFirst="0" w:colLast="0"/>
+      <w:bookmarkStart w:id="0" w:name="_heading=h.gjdgxs" w:colFirst="0" w:colLast="0"/>
+      <w:bookmarkEnd w:id="0"/>
+      <w:r>
+        <w:t>202</w:t>
+      </w:r>
+      <w:r>
+        <w:t>6</w:t>
+      </w:r>
+    </w:p>
+    <w:p>
+      <w:pPr>
+        <w:pStyle w:val="Heading1"/>
+      </w:pPr>
+      <w:bookmarkStart w:id="1" w:name="_heading=h.3j2qqm3" w:colFirst="0" w:colLast="0"/>
       <w:bookmarkEnd w:id="1"/>
-      <w:r>
-        <w:t>2022</w:t>
-      </w:r>
-    </w:p>
-    <w:p>
-      <w:pPr>
-        <w:pStyle w:val="Heading1"/>
-      </w:pPr>
-      <w:bookmarkStart w:id="2" w:name="_heading=h.3j2qqm3" w:colFirst="0" w:colLast="0"/>
-      <w:bookmarkEnd w:id="2"/>
       <w:r>
         <w:lastRenderedPageBreak/>
         <w:t xml:space="preserve">HALAMAN PERSETUJUAN </w:t>
@@ -698,8 +693,8 @@
           <w:color w:val="000000"/>
         </w:rPr>
       </w:pPr>
-      <w:bookmarkStart w:id="3" w:name="_heading=h.1y810tw" w:colFirst="0" w:colLast="0"/>
-      <w:bookmarkEnd w:id="3"/>
+      <w:bookmarkStart w:id="2" w:name="_heading=h.1y810tw" w:colFirst="0" w:colLast="0"/>
+      <w:bookmarkEnd w:id="2"/>
       <w:r>
         <w:rPr>
           <w:b/>
@@ -723,22 +718,33 @@
         <w:jc w:val="center"/>
         <w:rPr>
           <w:b/>
-          <w:color w:val="000000"/>
-        </w:rPr>
-      </w:pPr>
-      <w:r>
-        <w:rPr>
-          <w:b/>
-          <w:color w:val="000000"/>
-        </w:rPr>
-        <w:t xml:space="preserve">TULISKAN JUDUL SKRIPSI ANDA DI SINI DENGAN </w:t>
-      </w:r>
-      <w:r>
-        <w:rPr>
-          <w:b/>
-          <w:color w:val="FF0000"/>
-        </w:rPr>
-        <w:t>(Font TNR 12 pt Bold) SEMUA DITULIS DENGAN HURUF KAPITAL, SPASI 1.5  RATA TENGAH)</w:t>
+          <w:sz w:val="28"/>
+          <w:szCs w:val="28"/>
+        </w:rPr>
+      </w:pPr>
+      <w:r>
+        <w:rPr>
+          <w:b/>
+          <w:sz w:val="28"/>
+          <w:szCs w:val="28"/>
+        </w:rPr>
+        <w:t>“</w:t>
+      </w:r>
+      <w:r>
+        <w:rPr>
+          <w:b/>
+          <w:sz w:val="28"/>
+          <w:szCs w:val="28"/>
+        </w:rPr>
+        <w:t>Implementasi</w:t>
+      </w:r>
+      <w:r>
+        <w:rPr>
+          <w:b/>
+          <w:sz w:val="28"/>
+          <w:szCs w:val="28"/>
+        </w:rPr>
+        <w:t xml:space="preserve"> Learning to Rank dalam Identifikasi Risiko Transaksi Fraud pada Sistem Keuangan Digital”</w:t>
       </w:r>
     </w:p>
     <w:p>
@@ -838,7 +844,7 @@
         <w:rPr>
           <w:b/>
         </w:rPr>
-        <w:t>Nama Mahasiswa</w:t>
+        <w:t>Azizi Egatri Mu’thi</w:t>
       </w:r>
     </w:p>
     <w:p>
@@ -853,7 +859,7 @@
         <w:rPr>
           <w:b/>
         </w:rPr>
-        <w:t>xx.xx.xxxx</w:t>
+        <w:t>22.11.4800</w:t>
       </w:r>
     </w:p>
     <w:p>
@@ -966,10 +972,19 @@
       <w:r>
         <w:rPr>
           <w:b/>
+          <w:bCs/>
           <w:color w:val="000000"/>
           <w:u w:val="single"/>
         </w:rPr>
-        <w:t xml:space="preserve">Nama Dosen Pembimbing </w:t>
+        <w:t>Dr. Hartatik, S.T., M.Cs.</w:t>
+      </w:r>
+      <w:r>
+        <w:rPr>
+          <w:b/>
+          <w:color w:val="000000"/>
+          <w:u w:val="single"/>
+        </w:rPr>
+        <w:t xml:space="preserve"> </w:t>
       </w:r>
     </w:p>
     <w:p>
@@ -1001,8 +1016,8 @@
       <w:pPr>
         <w:pStyle w:val="Heading1"/>
       </w:pPr>
-      <w:bookmarkStart w:id="4" w:name="_heading=h.4i7ojhp" w:colFirst="0" w:colLast="0"/>
-      <w:bookmarkEnd w:id="4"/>
+      <w:bookmarkStart w:id="3" w:name="_heading=h.4i7ojhp" w:colFirst="0" w:colLast="0"/>
+      <w:bookmarkEnd w:id="3"/>
       <w:r>
         <w:lastRenderedPageBreak/>
         <w:t>HALAMAN PENGESAHAN</w:t>
@@ -1050,35 +1065,52 @@
         <w:jc w:val="center"/>
         <w:rPr>
           <w:b/>
-          <w:color w:val="000000"/>
-        </w:rPr>
-      </w:pPr>
-      <w:r>
-        <w:rPr>
-          <w:b/>
-          <w:color w:val="000000"/>
-        </w:rPr>
-        <w:t xml:space="preserve">TULISKAN JUDUL SKRIPSI ANDA DI SINI DENGAN </w:t>
-      </w:r>
-      <w:r>
-        <w:rPr>
-          <w:b/>
-          <w:color w:val="FF0000"/>
-        </w:rPr>
-        <w:t>(Font TNR 12 pt Bold) SEMUA DITULIS DENGAN HURUF KAPITAL, SPASI 1.5  RATA TENGAH)</w:t>
-      </w:r>
+          <w:sz w:val="28"/>
+          <w:szCs w:val="28"/>
+        </w:rPr>
+      </w:pPr>
+      <w:r>
+        <w:rPr>
+          <w:b/>
+          <w:sz w:val="28"/>
+          <w:szCs w:val="28"/>
+        </w:rPr>
+        <w:t>“</w:t>
+      </w:r>
+      <w:r>
+        <w:rPr>
+          <w:b/>
+          <w:sz w:val="28"/>
+          <w:szCs w:val="28"/>
+        </w:rPr>
+        <w:t>Implementasi</w:t>
+      </w:r>
+      <w:r>
+        <w:rPr>
+          <w:b/>
+          <w:sz w:val="28"/>
+          <w:szCs w:val="28"/>
+        </w:rPr>
+        <w:t xml:space="preserve"> Learning to Rank dalam Identifikasi Risiko Transaksi Fraud pada Sistem Keuangan Digital”</w:t>
+      </w:r>
+    </w:p>
+    <w:p>
+      <w:pPr>
+        <w:spacing w:after="0"/>
+        <w:jc w:val="center"/>
+        <w:rPr>
+          <w:b/>
+          <w:sz w:val="28"/>
+          <w:szCs w:val="28"/>
+          <w:lang w:val="en-ID"/>
+        </w:rPr>
+      </w:pPr>
     </w:p>
     <w:p>
       <w:pPr>
         <w:spacing w:after="0" w:line="240" w:lineRule="auto"/>
         <w:jc w:val="center"/>
       </w:pPr>
-    </w:p>
-    <w:p>
-      <w:pPr>
-        <w:spacing w:after="0" w:line="240" w:lineRule="auto"/>
-        <w:jc w:val="center"/>
-      </w:pPr>
       <w:r>
         <w:t>yang disusun dan diajukan oleh</w:t>
       </w:r>
@@ -1087,7 +1119,7 @@
           <w:noProof/>
         </w:rPr>
         <w:drawing>
-          <wp:anchor distT="0" distB="0" distL="0" distR="0" simplePos="0" relativeHeight="251658240" behindDoc="1" locked="0" layoutInCell="1" allowOverlap="1" wp14:anchorId="180959AD" wp14:editId="46829657">
+          <wp:anchor distT="0" distB="0" distL="0" distR="0" simplePos="0" relativeHeight="251658240" behindDoc="1" locked="0" layoutInCell="1" allowOverlap="1" wp14:anchorId="180959AD" wp14:editId="22F1F1A0">
             <wp:simplePos x="0" y="0"/>
             <wp:positionH relativeFrom="column">
               <wp:posOffset>687705</wp:posOffset>
@@ -1162,7 +1194,7 @@
         <w:rPr>
           <w:b/>
         </w:rPr>
-        <w:t>Nama Mahasiswa</w:t>
+        <w:t>Azizi Egatri Mu’thi</w:t>
       </w:r>
     </w:p>
     <w:p>
@@ -1177,7 +1209,7 @@
         <w:rPr>
           <w:b/>
         </w:rPr>
-        <w:t>xx.xx.xxxx</w:t>
+        <w:t>22.11.4800</w:t>
       </w:r>
     </w:p>
     <w:p>
@@ -1212,8 +1244,8 @@
           <w:b/>
         </w:rPr>
       </w:pPr>
-      <w:bookmarkStart w:id="5" w:name="_heading=h.30j0zll" w:colFirst="0" w:colLast="0"/>
-      <w:bookmarkEnd w:id="5"/>
+      <w:bookmarkStart w:id="4" w:name="_heading=h.30j0zll" w:colFirst="0" w:colLast="0"/>
+      <w:bookmarkEnd w:id="4"/>
       <w:r>
         <w:rPr>
           <w:b/>
@@ -1586,27 +1618,27 @@
       <w:pPr>
         <w:jc w:val="center"/>
       </w:pPr>
-      <w:bookmarkStart w:id="6" w:name="_heading=h.1fob9te" w:colFirst="0" w:colLast="0"/>
+      <w:bookmarkStart w:id="5" w:name="_heading=h.1fob9te" w:colFirst="0" w:colLast="0"/>
+      <w:bookmarkEnd w:id="5"/>
+      <w:r>
+        <w:rPr>
+          <w:b/>
+        </w:rPr>
+        <w:t>NIK. 190302</w:t>
+      </w:r>
+      <w:r>
+        <w:rPr>
+          <w:b/>
+        </w:rPr>
+        <w:t>106</w:t>
+      </w:r>
+    </w:p>
+    <w:p>
+      <w:pPr>
+        <w:pStyle w:val="Heading1"/>
+      </w:pPr>
+      <w:bookmarkStart w:id="6" w:name="_heading=h.2xcytpi" w:colFirst="0" w:colLast="0"/>
       <w:bookmarkEnd w:id="6"/>
-      <w:r>
-        <w:rPr>
-          <w:b/>
-        </w:rPr>
-        <w:t>NIK. 190302</w:t>
-      </w:r>
-      <w:r>
-        <w:rPr>
-          <w:b/>
-        </w:rPr>
-        <w:t>106</w:t>
-      </w:r>
-    </w:p>
-    <w:p>
-      <w:pPr>
-        <w:pStyle w:val="Heading1"/>
-      </w:pPr>
-      <w:bookmarkStart w:id="7" w:name="_heading=h.2xcytpi" w:colFirst="0" w:colLast="0"/>
-      <w:bookmarkEnd w:id="7"/>
       <w:r>
         <w:lastRenderedPageBreak/>
         <w:t>HALAMAN PERNYATAAN KEASLIAN SKRIPSI</w:t>
@@ -1681,7 +1713,14 @@
           <w:color w:val="000000"/>
         </w:rPr>
         <w:tab/>
-        <w:t xml:space="preserve">: Nama Mahasiswa </w:t>
+        <w:t xml:space="preserve">: </w:t>
+      </w:r>
+      <w:r>
+        <w:rPr>
+          <w:b/>
+          <w:color w:val="000000"/>
+        </w:rPr>
+        <w:t>Azizi Egatri Mu’thi</w:t>
       </w:r>
     </w:p>
     <w:p>
@@ -1715,7 +1754,14 @@
           <w:color w:val="000000"/>
         </w:rPr>
         <w:tab/>
-        <w:t>: XX.XX.XXXX</w:t>
+        <w:t xml:space="preserve">: </w:t>
+      </w:r>
+      <w:r>
+        <w:rPr>
+          <w:b/>
+          <w:color w:val="000000"/>
+        </w:rPr>
+        <w:t>22.11.4800</w:t>
       </w:r>
     </w:p>
     <w:p>
@@ -1772,25 +1818,37 @@
     </w:p>
     <w:p>
       <w:pPr>
-        <w:pBdr>
-          <w:top w:val="nil"/>
-          <w:left w:val="nil"/>
-          <w:bottom w:val="nil"/>
-          <w:right w:val="nil"/>
-          <w:between w:val="nil"/>
-        </w:pBdr>
-        <w:spacing w:after="0" w:line="240" w:lineRule="auto"/>
-        <w:rPr>
-          <w:b/>
-          <w:color w:val="000000"/>
-        </w:rPr>
-      </w:pPr>
-      <w:r>
-        <w:rPr>
-          <w:b/>
-          <w:color w:val="000000"/>
-        </w:rPr>
-        <w:t>Tuliskan Judul Skripsi</w:t>
+        <w:spacing w:after="0"/>
+        <w:jc w:val="center"/>
+        <w:rPr>
+          <w:b/>
+          <w:sz w:val="28"/>
+          <w:szCs w:val="28"/>
+        </w:rPr>
+      </w:pPr>
+      <w:r>
+        <w:rPr>
+          <w:b/>
+          <w:sz w:val="28"/>
+          <w:szCs w:val="28"/>
+        </w:rPr>
+        <w:t>“</w:t>
+      </w:r>
+      <w:r>
+        <w:rPr>
+          <w:b/>
+          <w:sz w:val="28"/>
+          <w:szCs w:val="28"/>
+        </w:rPr>
+        <w:t>Implementasi</w:t>
+      </w:r>
+      <w:r>
+        <w:rPr>
+          <w:b/>
+          <w:sz w:val="28"/>
+          <w:szCs w:val="28"/>
+        </w:rPr>
+        <w:t xml:space="preserve"> Learning to Rank dalam Identifikasi Risiko Transaksi Fraud pada Sistem Keuangan Digital”</w:t>
       </w:r>
     </w:p>
     <w:p>
@@ -2170,25 +2228,15 @@
         <w:rPr>
           <w:color w:val="000000"/>
         </w:rPr>
-        <w:t>Nama Mahasiswa</w:t>
-      </w:r>
-    </w:p>
-    <w:p>
-      <w:pPr>
-        <w:rPr>
-          <w:b/>
-        </w:rPr>
-      </w:pPr>
-      <w:r>
-        <w:br w:type="page"/>
+        <w:t>Azizi Egatri Mu’thi</w:t>
       </w:r>
     </w:p>
     <w:p>
       <w:pPr>
         <w:pStyle w:val="Heading1"/>
       </w:pPr>
-      <w:bookmarkStart w:id="8" w:name="_heading=h.3znysh7" w:colFirst="0" w:colLast="0"/>
-      <w:bookmarkEnd w:id="8"/>
+      <w:bookmarkStart w:id="7" w:name="_heading=h.3znysh7" w:colFirst="0" w:colLast="0"/>
+      <w:bookmarkEnd w:id="7"/>
       <w:r>
         <w:lastRenderedPageBreak/>
         <w:t>HALAMAN PERSEMBAHAN</w:t>
@@ -2215,8 +2263,8 @@
       <w:pPr>
         <w:pStyle w:val="Heading1"/>
       </w:pPr>
-      <w:bookmarkStart w:id="9" w:name="_heading=h.2et92p0" w:colFirst="0" w:colLast="0"/>
-      <w:bookmarkEnd w:id="9"/>
+      <w:bookmarkStart w:id="8" w:name="_heading=h.2et92p0" w:colFirst="0" w:colLast="0"/>
+      <w:bookmarkEnd w:id="8"/>
       <w:r>
         <w:lastRenderedPageBreak/>
         <w:t>KATA PENGANTAR</w:t>
@@ -2294,18 +2342,18 @@
         <w:ind w:firstLine="709"/>
         <w:jc w:val="both"/>
       </w:pPr>
-      <w:bookmarkStart w:id="10" w:name="_heading=h.tyjcwt" w:colFirst="0" w:colLast="0"/>
+      <w:bookmarkStart w:id="9" w:name="_heading=h.tyjcwt" w:colFirst="0" w:colLast="0"/>
+      <w:bookmarkEnd w:id="9"/>
+      <w:r>
+        <w:br w:type="page"/>
+      </w:r>
+    </w:p>
+    <w:p>
+      <w:pPr>
+        <w:pStyle w:val="Heading1"/>
+      </w:pPr>
+      <w:bookmarkStart w:id="10" w:name="_heading=h.1ci93xb" w:colFirst="0" w:colLast="0"/>
       <w:bookmarkEnd w:id="10"/>
-      <w:r>
-        <w:br w:type="page"/>
-      </w:r>
-    </w:p>
-    <w:p>
-      <w:pPr>
-        <w:pStyle w:val="Heading1"/>
-      </w:pPr>
-      <w:bookmarkStart w:id="11" w:name="_heading=h.1ci93xb" w:colFirst="0" w:colLast="0"/>
-      <w:bookmarkEnd w:id="11"/>
       <w:r>
         <w:lastRenderedPageBreak/>
         <w:t>DAFTAR ISI</w:t>
@@ -4020,8 +4068,8 @@
       <w:pPr>
         <w:pStyle w:val="Heading1"/>
       </w:pPr>
-      <w:bookmarkStart w:id="12" w:name="_heading=h.3whwml4" w:colFirst="0" w:colLast="0"/>
-      <w:bookmarkEnd w:id="12"/>
+      <w:bookmarkStart w:id="11" w:name="_heading=h.3whwml4" w:colFirst="0" w:colLast="0"/>
+      <w:bookmarkEnd w:id="11"/>
       <w:r>
         <w:lastRenderedPageBreak/>
         <w:t>DAFTAR TABEL</w:t>
@@ -4125,8 +4173,8 @@
       <w:pPr>
         <w:pStyle w:val="Heading1"/>
       </w:pPr>
-      <w:bookmarkStart w:id="13" w:name="_heading=h.2bn6wsx" w:colFirst="0" w:colLast="0"/>
-      <w:bookmarkEnd w:id="13"/>
+      <w:bookmarkStart w:id="12" w:name="_heading=h.2bn6wsx" w:colFirst="0" w:colLast="0"/>
+      <w:bookmarkEnd w:id="12"/>
       <w:r>
         <w:lastRenderedPageBreak/>
         <w:t>DAFTAR GAMBAR</w:t>
@@ -4232,8 +4280,8 @@
       <w:pPr>
         <w:pStyle w:val="Heading1"/>
       </w:pPr>
-      <w:bookmarkStart w:id="14" w:name="_heading=h.qsh70q" w:colFirst="0" w:colLast="0"/>
-      <w:bookmarkEnd w:id="14"/>
+      <w:bookmarkStart w:id="13" w:name="_heading=h.qsh70q" w:colFirst="0" w:colLast="0"/>
+      <w:bookmarkEnd w:id="13"/>
       <w:r>
         <w:lastRenderedPageBreak/>
         <w:t>DAFTAR LAMPIRAN</w:t>
@@ -4328,8 +4376,8 @@
       <w:pPr>
         <w:pStyle w:val="Heading1"/>
       </w:pPr>
-      <w:bookmarkStart w:id="15" w:name="_heading=h.3as4poj" w:colFirst="0" w:colLast="0"/>
-      <w:bookmarkEnd w:id="15"/>
+      <w:bookmarkStart w:id="14" w:name="_heading=h.3as4poj" w:colFirst="0" w:colLast="0"/>
+      <w:bookmarkEnd w:id="14"/>
       <w:r>
         <w:lastRenderedPageBreak/>
         <w:t>DAFTAR LAMBANG DAN SINGKATAN</w:t>
@@ -4411,8 +4459,8 @@
       <w:pPr>
         <w:pStyle w:val="Heading1"/>
       </w:pPr>
-      <w:bookmarkStart w:id="16" w:name="_heading=h.1pxezwc" w:colFirst="0" w:colLast="0"/>
-      <w:bookmarkEnd w:id="16"/>
+      <w:bookmarkStart w:id="15" w:name="_heading=h.1pxezwc" w:colFirst="0" w:colLast="0"/>
+      <w:bookmarkEnd w:id="15"/>
       <w:r>
         <w:lastRenderedPageBreak/>
         <w:t>DAFTAR ISTILAH</w:t>
@@ -4471,8 +4519,8 @@
       <w:pPr>
         <w:pStyle w:val="Heading1"/>
       </w:pPr>
-      <w:bookmarkStart w:id="17" w:name="_heading=h.1t3h5sf" w:colFirst="0" w:colLast="0"/>
-      <w:bookmarkEnd w:id="17"/>
+      <w:bookmarkStart w:id="16" w:name="_heading=h.1t3h5sf" w:colFirst="0" w:colLast="0"/>
+      <w:bookmarkEnd w:id="16"/>
       <w:r>
         <w:lastRenderedPageBreak/>
         <w:t>INTISARI</w:t>
@@ -4561,8 +4609,8 @@
           <w:i/>
         </w:rPr>
       </w:pPr>
-      <w:bookmarkStart w:id="18" w:name="_heading=h.49x2ik5" w:colFirst="0" w:colLast="0"/>
-      <w:bookmarkEnd w:id="18"/>
+      <w:bookmarkStart w:id="17" w:name="_heading=h.49x2ik5" w:colFirst="0" w:colLast="0"/>
+      <w:bookmarkEnd w:id="17"/>
       <w:r>
         <w:rPr>
           <w:i/>
@@ -4621,8 +4669,8 @@
       <w:pPr>
         <w:pStyle w:val="Heading1"/>
       </w:pPr>
-      <w:bookmarkStart w:id="19" w:name="_heading=h.2p2csry" w:colFirst="0" w:colLast="0"/>
-      <w:bookmarkEnd w:id="19"/>
+      <w:bookmarkStart w:id="18" w:name="_heading=h.2p2csry" w:colFirst="0" w:colLast="0"/>
+      <w:bookmarkEnd w:id="18"/>
       <w:r>
         <w:lastRenderedPageBreak/>
         <w:t xml:space="preserve">BAB I </w:t>
@@ -4642,8 +4690,8 @@
         </w:numPr>
         <w:ind w:hanging="720"/>
       </w:pPr>
-      <w:bookmarkStart w:id="20" w:name="_heading=h.147n2zr" w:colFirst="0" w:colLast="0"/>
-      <w:bookmarkEnd w:id="20"/>
+      <w:bookmarkStart w:id="19" w:name="_heading=h.147n2zr" w:colFirst="0" w:colLast="0"/>
+      <w:bookmarkEnd w:id="19"/>
       <w:r>
         <w:t>Latar Belakang</w:t>
       </w:r>
@@ -4714,8 +4762,8 @@
         </w:numPr>
         <w:ind w:hanging="720"/>
       </w:pPr>
-      <w:bookmarkStart w:id="21" w:name="_heading=h.3o7alnk" w:colFirst="0" w:colLast="0"/>
-      <w:bookmarkEnd w:id="21"/>
+      <w:bookmarkStart w:id="20" w:name="_heading=h.3o7alnk" w:colFirst="0" w:colLast="0"/>
+      <w:bookmarkEnd w:id="20"/>
       <w:r>
         <w:lastRenderedPageBreak/>
         <w:t>Rumusan Masalah</w:t>
@@ -4922,8 +4970,8 @@
         </w:numPr>
         <w:ind w:hanging="720"/>
       </w:pPr>
-      <w:bookmarkStart w:id="22" w:name="_heading=h.23ckvvd" w:colFirst="0" w:colLast="0"/>
-      <w:bookmarkEnd w:id="22"/>
+      <w:bookmarkStart w:id="21" w:name="_heading=h.23ckvvd" w:colFirst="0" w:colLast="0"/>
+      <w:bookmarkEnd w:id="21"/>
       <w:r>
         <w:t>Batasan Masalah</w:t>
       </w:r>
@@ -4955,8 +5003,8 @@
         </w:numPr>
         <w:ind w:hanging="720"/>
       </w:pPr>
-      <w:bookmarkStart w:id="23" w:name="_heading=h.ihv636" w:colFirst="0" w:colLast="0"/>
-      <w:bookmarkEnd w:id="23"/>
+      <w:bookmarkStart w:id="22" w:name="_heading=h.ihv636" w:colFirst="0" w:colLast="0"/>
+      <w:bookmarkEnd w:id="22"/>
       <w:r>
         <w:t>Tujuan Penelitian</w:t>
       </w:r>
@@ -5007,8 +5055,8 @@
         </w:numPr>
         <w:ind w:hanging="720"/>
       </w:pPr>
-      <w:bookmarkStart w:id="24" w:name="_heading=h.32hioqz" w:colFirst="0" w:colLast="0"/>
-      <w:bookmarkEnd w:id="24"/>
+      <w:bookmarkStart w:id="23" w:name="_heading=h.32hioqz" w:colFirst="0" w:colLast="0"/>
+      <w:bookmarkEnd w:id="23"/>
       <w:r>
         <w:t>Manfaat Penelitian</w:t>
       </w:r>
@@ -5055,8 +5103,8 @@
         </w:numPr>
         <w:ind w:hanging="720"/>
       </w:pPr>
-      <w:bookmarkStart w:id="25" w:name="_heading=h.1hmsyys" w:colFirst="0" w:colLast="0"/>
-      <w:bookmarkEnd w:id="25"/>
+      <w:bookmarkStart w:id="24" w:name="_heading=h.1hmsyys" w:colFirst="0" w:colLast="0"/>
+      <w:bookmarkEnd w:id="24"/>
       <w:r>
         <w:t>Sistematika Penulisan</w:t>
       </w:r>
@@ -5148,8 +5196,8 @@
         <w:spacing w:before="120" w:after="120"/>
         <w:jc w:val="both"/>
       </w:pPr>
-      <w:bookmarkStart w:id="26" w:name="_heading=h.3dy6vkm" w:colFirst="0" w:colLast="0"/>
-      <w:bookmarkEnd w:id="26"/>
+      <w:bookmarkStart w:id="25" w:name="_heading=h.3dy6vkm" w:colFirst="0" w:colLast="0"/>
+      <w:bookmarkEnd w:id="25"/>
       <w:r>
         <w:t>BAB III METODE PENELITIAN, didalamnya terdapat tinjauan umum tentang objek penelitian, analisis masalah, solusi yang ditawarkan, rancangan, …</w:t>
       </w:r>
@@ -5201,8 +5249,8 @@
       <w:pPr>
         <w:pStyle w:val="Heading1"/>
       </w:pPr>
-      <w:bookmarkStart w:id="27" w:name="_heading=h.40hj5kuim1a2" w:colFirst="0" w:colLast="0"/>
-      <w:bookmarkEnd w:id="27"/>
+      <w:bookmarkStart w:id="26" w:name="_heading=h.40hj5kuim1a2" w:colFirst="0" w:colLast="0"/>
+      <w:bookmarkEnd w:id="26"/>
       <w:r>
         <w:lastRenderedPageBreak/>
         <w:t xml:space="preserve">BAB II </w:t>
@@ -5222,8 +5270,8 @@
         </w:numPr>
         <w:ind w:hanging="720"/>
       </w:pPr>
-      <w:bookmarkStart w:id="28" w:name="_heading=h.4d34og8" w:colFirst="0" w:colLast="0"/>
-      <w:bookmarkEnd w:id="28"/>
+      <w:bookmarkStart w:id="27" w:name="_heading=h.4d34og8" w:colFirst="0" w:colLast="0"/>
+      <w:bookmarkEnd w:id="27"/>
       <w:r>
         <w:t>Studi Literatur</w:t>
       </w:r>
@@ -6013,8 +6061,8 @@
         </w:numPr>
         <w:ind w:hanging="720"/>
       </w:pPr>
-      <w:bookmarkStart w:id="29" w:name="_heading=h.uiko5c74wz3l" w:colFirst="0" w:colLast="0"/>
-      <w:bookmarkEnd w:id="29"/>
+      <w:bookmarkStart w:id="28" w:name="_heading=h.uiko5c74wz3l" w:colFirst="0" w:colLast="0"/>
+      <w:bookmarkEnd w:id="28"/>
       <w:r>
         <w:lastRenderedPageBreak/>
         <w:t xml:space="preserve">Dasar Teori </w:t>
@@ -6148,8 +6196,8 @@
         <w:spacing w:after="0"/>
         <w:jc w:val="center"/>
       </w:pPr>
-      <w:bookmarkStart w:id="30" w:name="_heading=h.26in1rg" w:colFirst="0" w:colLast="0"/>
-      <w:bookmarkEnd w:id="30"/>
+      <w:bookmarkStart w:id="29" w:name="_heading=h.26in1rg" w:colFirst="0" w:colLast="0"/>
+      <w:bookmarkEnd w:id="29"/>
       <w:r>
         <w:t>Gambar 2.1.  Kuliner - Yimmi Tomyam</w:t>
       </w:r>
@@ -6264,8 +6312,8 @@
           <w:b/>
         </w:rPr>
       </w:pPr>
-      <w:bookmarkStart w:id="31" w:name="_heading=h.8s5xjpq672qz" w:colFirst="0" w:colLast="0"/>
-      <w:bookmarkEnd w:id="31"/>
+      <w:bookmarkStart w:id="30" w:name="_heading=h.8s5xjpq672qz" w:colFirst="0" w:colLast="0"/>
+      <w:bookmarkEnd w:id="30"/>
     </w:p>
     <w:p>
       <w:pPr>
@@ -6463,8 +6511,8 @@
               <w:spacing w:after="0" w:line="240" w:lineRule="auto"/>
               <w:jc w:val="center"/>
             </w:pPr>
-            <w:bookmarkStart w:id="32" w:name="_heading=h.35nkun2" w:colFirst="0" w:colLast="0"/>
-            <w:bookmarkEnd w:id="32"/>
+            <w:bookmarkStart w:id="31" w:name="_heading=h.35nkun2" w:colFirst="0" w:colLast="0"/>
+            <w:bookmarkEnd w:id="31"/>
             <w:r>
               <w:t>(2-0)</w:t>
             </w:r>
@@ -6478,8 +6526,8 @@
         <w:spacing w:after="0"/>
         <w:ind w:left="567"/>
       </w:pPr>
-      <w:bookmarkStart w:id="33" w:name="_heading=h.1ksv4uv" w:colFirst="0" w:colLast="0"/>
-      <w:bookmarkEnd w:id="33"/>
+      <w:bookmarkStart w:id="32" w:name="_heading=h.1ksv4uv" w:colFirst="0" w:colLast="0"/>
+      <w:bookmarkEnd w:id="32"/>
       <w:r>
         <w:t>dengan</w:t>
       </w:r>
@@ -6715,8 +6763,8 @@
         <w:spacing w:after="0"/>
         <w:jc w:val="center"/>
       </w:pPr>
-      <w:bookmarkStart w:id="34" w:name="_heading=h.3rdcrjn" w:colFirst="0" w:colLast="0"/>
-      <w:bookmarkEnd w:id="34"/>
+      <w:bookmarkStart w:id="33" w:name="_heading=h.3rdcrjn" w:colFirst="0" w:colLast="0"/>
+      <w:bookmarkEnd w:id="33"/>
       <w:r>
         <w:t>Tabel 2.2 Contoh template untuk tabel</w:t>
       </w:r>
@@ -7108,8 +7156,8 @@
         <w:spacing w:after="0"/>
         <w:jc w:val="center"/>
       </w:pPr>
-      <w:bookmarkStart w:id="35" w:name="_heading=h.p3vvzylbm4eg" w:colFirst="0" w:colLast="0"/>
-      <w:bookmarkEnd w:id="35"/>
+      <w:bookmarkStart w:id="34" w:name="_heading=h.p3vvzylbm4eg" w:colFirst="0" w:colLast="0"/>
+      <w:bookmarkEnd w:id="34"/>
       <w:r>
         <w:t xml:space="preserve"> </w:t>
       </w:r>
@@ -7139,8 +7187,8 @@
       <w:pPr>
         <w:pStyle w:val="Heading1"/>
       </w:pPr>
-      <w:bookmarkStart w:id="36" w:name="_heading=h.41mghml" w:colFirst="0" w:colLast="0"/>
-      <w:bookmarkEnd w:id="36"/>
+      <w:bookmarkStart w:id="35" w:name="_heading=h.41mghml" w:colFirst="0" w:colLast="0"/>
+      <w:bookmarkEnd w:id="35"/>
       <w:r>
         <w:lastRenderedPageBreak/>
         <w:t>BAB III</w:t>
@@ -7158,8 +7206,8 @@
         <w:widowControl w:val="0"/>
         <w:spacing w:before="240" w:after="240" w:line="240" w:lineRule="auto"/>
       </w:pPr>
-      <w:bookmarkStart w:id="37" w:name="_heading=h.2grqrue" w:colFirst="0" w:colLast="0"/>
-      <w:bookmarkEnd w:id="37"/>
+      <w:bookmarkStart w:id="36" w:name="_heading=h.2grqrue" w:colFirst="0" w:colLast="0"/>
+      <w:bookmarkEnd w:id="36"/>
       <w:r>
         <w:t>3.1</w:t>
       </w:r>
@@ -7174,7 +7222,39 @@
       </w:pPr>
       <w:r>
         <w:tab/>
-        <w:t>Objek Penelitian adalah hal yang menjadi sasaran penelitian / himpunan elemen yang dapat berupa orang, organisasi atau barang yang akan diteliti maupun lokasi/tempat penelitian.</w:t>
+        <w:t xml:space="preserve">Objek Penelitian </w:t>
+      </w:r>
+      <w:r>
+        <w:t>pada penelitian ini adalah data investor yang di tunjukkan atau direpresentasikan melalui fitur – fitur perilaku seperti transaksi pada platform, profit, frekuensi Transaksi, win rate investor dan indikator kinerja lainnya.</w:t>
+      </w:r>
+    </w:p>
+    <w:p>
+      <w:pPr>
+        <w:jc w:val="both"/>
+      </w:pPr>
+      <w:r>
+        <w:t xml:space="preserve">Data yang di miliki oleh platform investasi tersebut digunakan untuk  mengidentifikasi tingkat masing – masing risiko investor dengan pendeketan </w:t>
+      </w:r>
+      <w:r>
+        <w:rPr>
+          <w:b/>
+          <w:bCs/>
+          <w:i/>
+          <w:iCs/>
+        </w:rPr>
+        <w:t>Learning To Rank</w:t>
+      </w:r>
+      <w:r>
+        <w:rPr>
+          <w:b/>
+          <w:bCs/>
+          <w:i/>
+          <w:iCs/>
+        </w:rPr>
+        <w:t xml:space="preserve"> (LRT), </w:t>
+      </w:r>
+      <w:r>
+        <w:t>dimana user/investor tidak hanyak diklasifikasikan berdasarkan berisiko atau tidak berisiko, tetapi juga di urutkan berdasarakan tingkat resiko relatifnya</w:t>
       </w:r>
     </w:p>
     <w:p>
@@ -7184,8 +7264,8 @@
         <w:widowControl w:val="0"/>
         <w:spacing w:before="240" w:after="240" w:line="240" w:lineRule="auto"/>
       </w:pPr>
-      <w:bookmarkStart w:id="38" w:name="_heading=h.vx1227" w:colFirst="0" w:colLast="0"/>
-      <w:bookmarkEnd w:id="38"/>
+      <w:bookmarkStart w:id="37" w:name="_heading=h.vx1227" w:colFirst="0" w:colLast="0"/>
+      <w:bookmarkEnd w:id="37"/>
       <w:r>
         <w:t>3.2</w:t>
       </w:r>
@@ -7248,6 +7328,7 @@
         <w:rPr>
           <w:noProof/>
         </w:rPr>
+        <w:lastRenderedPageBreak/>
         <w:drawing>
           <wp:inline distT="0" distB="0" distL="0" distR="0" wp14:anchorId="4FB9D945" wp14:editId="0BC3A479">
             <wp:extent cx="2819400" cy="4145280"/>
@@ -7319,10 +7400,9 @@
         <w:widowControl w:val="0"/>
         <w:spacing w:before="240" w:after="240" w:line="240" w:lineRule="auto"/>
       </w:pPr>
-      <w:bookmarkStart w:id="39" w:name="_heading=h.3fwokq0" w:colFirst="0" w:colLast="0"/>
-      <w:bookmarkEnd w:id="39"/>
-      <w:r>
-        <w:lastRenderedPageBreak/>
+      <w:bookmarkStart w:id="38" w:name="_heading=h.3fwokq0" w:colFirst="0" w:colLast="0"/>
+      <w:bookmarkEnd w:id="38"/>
+      <w:r>
         <w:t>3.3</w:t>
       </w:r>
       <w:r>
@@ -7387,8 +7467,8 @@
       <w:pPr>
         <w:pStyle w:val="Heading1"/>
       </w:pPr>
-      <w:bookmarkStart w:id="40" w:name="_heading=h.1v1yuxt" w:colFirst="0" w:colLast="0"/>
-      <w:bookmarkEnd w:id="40"/>
+      <w:bookmarkStart w:id="39" w:name="_heading=h.1v1yuxt" w:colFirst="0" w:colLast="0"/>
+      <w:bookmarkEnd w:id="39"/>
       <w:r>
         <w:lastRenderedPageBreak/>
         <w:t>BAB IV</w:t>
@@ -7411,33 +7491,33 @@
       <w:pPr>
         <w:jc w:val="both"/>
       </w:pPr>
-      <w:bookmarkStart w:id="41" w:name="_heading=h.d3z7kuuarxz4" w:colFirst="0" w:colLast="0"/>
+      <w:bookmarkStart w:id="40" w:name="_heading=h.d3z7kuuarxz4" w:colFirst="0" w:colLast="0"/>
+      <w:bookmarkEnd w:id="40"/>
+      <w:r>
+        <w:rPr>
+          <w:color w:val="FF0000"/>
+        </w:rPr>
+        <w:t>Hasil penelitian disajikan dalam bentuk uraian, tabel dan gambar</w:t>
+      </w:r>
+      <w:r>
+        <w:t xml:space="preserve"> (gambar rancangan, grafik, foto, skema, sketsa, diagram, peta) </w:t>
+      </w:r>
+      <w:r>
+        <w:rPr>
+          <w:color w:val="FF0000"/>
+        </w:rPr>
+        <w:t>berdasarkan alur penelitian yang telah dilakukan pada bab 3</w:t>
+      </w:r>
+      <w:r>
+        <w:t>. Hasil penelitian perlu dibandingkan dengan hasil penelitian terdahulu yang relevan untuk dibahas lebih lanjut. Pembahasan diarahkan agar dapat menjawab tujuan penelitian.</w:t>
+      </w:r>
+    </w:p>
+    <w:p>
+      <w:pPr>
+        <w:jc w:val="both"/>
+      </w:pPr>
+      <w:bookmarkStart w:id="41" w:name="_heading=h.us3r3jwt2h4z" w:colFirst="0" w:colLast="0"/>
       <w:bookmarkEnd w:id="41"/>
-      <w:r>
-        <w:rPr>
-          <w:color w:val="FF0000"/>
-        </w:rPr>
-        <w:t>Hasil penelitian disajikan dalam bentuk uraian, tabel dan gambar</w:t>
-      </w:r>
-      <w:r>
-        <w:t xml:space="preserve"> (gambar rancangan, grafik, foto, skema, sketsa, diagram, peta) </w:t>
-      </w:r>
-      <w:r>
-        <w:rPr>
-          <w:color w:val="FF0000"/>
-        </w:rPr>
-        <w:t>berdasarkan alur penelitian yang telah dilakukan pada bab 3</w:t>
-      </w:r>
-      <w:r>
-        <w:t>. Hasil penelitian perlu dibandingkan dengan hasil penelitian terdahulu yang relevan untuk dibahas lebih lanjut. Pembahasan diarahkan agar dapat menjawab tujuan penelitian.</w:t>
-      </w:r>
-    </w:p>
-    <w:p>
-      <w:pPr>
-        <w:jc w:val="both"/>
-      </w:pPr>
-      <w:bookmarkStart w:id="42" w:name="_heading=h.us3r3jwt2h4z" w:colFirst="0" w:colLast="0"/>
-      <w:bookmarkEnd w:id="42"/>
     </w:p>
     <w:p>
       <w:pPr>
@@ -7490,8 +7570,8 @@
       <w:pPr>
         <w:pStyle w:val="Heading1"/>
       </w:pPr>
-      <w:bookmarkStart w:id="43" w:name="_heading=h.4f1mdlm" w:colFirst="0" w:colLast="0"/>
-      <w:bookmarkEnd w:id="43"/>
+      <w:bookmarkStart w:id="42" w:name="_heading=h.4f1mdlm" w:colFirst="0" w:colLast="0"/>
+      <w:bookmarkEnd w:id="42"/>
       <w:r>
         <w:lastRenderedPageBreak/>
         <w:t>BAB V</w:t>
@@ -7509,8 +7589,8 @@
         <w:widowControl w:val="0"/>
         <w:spacing w:before="0"/>
       </w:pPr>
-      <w:bookmarkStart w:id="44" w:name="_heading=h.2u6wntf" w:colFirst="0" w:colLast="0"/>
-      <w:bookmarkEnd w:id="44"/>
+      <w:bookmarkStart w:id="43" w:name="_heading=h.2u6wntf" w:colFirst="0" w:colLast="0"/>
+      <w:bookmarkEnd w:id="43"/>
       <w:r>
         <w:t>5.1</w:t>
       </w:r>
@@ -7610,8 +7690,8 @@
         <w:widowControl w:val="0"/>
         <w:spacing w:before="0"/>
       </w:pPr>
-      <w:bookmarkStart w:id="45" w:name="_heading=h.19c6y18" w:colFirst="0" w:colLast="0"/>
-      <w:bookmarkEnd w:id="45"/>
+      <w:bookmarkStart w:id="44" w:name="_heading=h.19c6y18" w:colFirst="0" w:colLast="0"/>
+      <w:bookmarkEnd w:id="44"/>
       <w:r>
         <w:t>5.2</w:t>
       </w:r>
@@ -7643,8 +7723,8 @@
         <w:widowControl w:val="0"/>
         <w:spacing w:before="360" w:after="360"/>
       </w:pPr>
-      <w:bookmarkStart w:id="46" w:name="_heading=h.3tbugp1" w:colFirst="0" w:colLast="0"/>
-      <w:bookmarkEnd w:id="46"/>
+      <w:bookmarkStart w:id="45" w:name="_heading=h.3tbugp1" w:colFirst="0" w:colLast="0"/>
+      <w:bookmarkEnd w:id="45"/>
       <w:r>
         <w:lastRenderedPageBreak/>
         <w:t>REFERENSI</w:t>
@@ -7657,8 +7737,8 @@
         <w:ind w:left="640" w:hanging="640"/>
         <w:jc w:val="both"/>
       </w:pPr>
-      <w:bookmarkStart w:id="47" w:name="_heading=h.2jxsxqh" w:colFirst="0" w:colLast="0"/>
-      <w:bookmarkEnd w:id="47"/>
+      <w:bookmarkStart w:id="46" w:name="_heading=h.2jxsxqh" w:colFirst="0" w:colLast="0"/>
+      <w:bookmarkEnd w:id="46"/>
       <w:r>
         <w:t>[1]</w:t>
       </w:r>
@@ -7741,8 +7821,8 @@
       <w:pPr>
         <w:pStyle w:val="Heading1"/>
       </w:pPr>
-      <w:bookmarkStart w:id="48" w:name="_heading=h.28h4qwu" w:colFirst="0" w:colLast="0"/>
-      <w:bookmarkEnd w:id="48"/>
+      <w:bookmarkStart w:id="47" w:name="_heading=h.28h4qwu" w:colFirst="0" w:colLast="0"/>
+      <w:bookmarkEnd w:id="47"/>
       <w:r>
         <w:lastRenderedPageBreak/>
         <w:t>LAMPIRAN</w:t>
@@ -9730,6 +9810,7 @@
   <w:style w:type="paragraph" w:default="1" w:styleId="Normal">
     <w:name w:val="Normal"/>
     <w:qFormat/>
+    <w:rsid w:val="00B67468"/>
     <w:pPr>
       <w:spacing w:after="160" w:line="360" w:lineRule="auto"/>
     </w:pPr>
@@ -9743,6 +9824,7 @@
     <w:name w:val="heading 1"/>
     <w:basedOn w:val="Normal"/>
     <w:next w:val="Normal"/>
+    <w:link w:val="Heading1Char"/>
     <w:uiPriority w:val="9"/>
     <w:qFormat/>
     <w:pPr>
@@ -9880,6 +9962,7 @@
     <w:name w:val="Title"/>
     <w:basedOn w:val="Normal"/>
     <w:next w:val="Normal"/>
+    <w:link w:val="TitleChar"/>
     <w:uiPriority w:val="10"/>
     <w:qFormat/>
     <w:pPr>
@@ -10046,6 +10129,32 @@
     <w:link w:val="Footer"/>
     <w:uiPriority w:val="99"/>
     <w:rsid w:val="006D5AE4"/>
+  </w:style>
+  <w:style w:type="character" w:customStyle="1" w:styleId="Heading1Char">
+    <w:name w:val="Heading 1 Char"/>
+    <w:basedOn w:val="DefaultParagraphFont"/>
+    <w:link w:val="Heading1"/>
+    <w:uiPriority w:val="9"/>
+    <w:rsid w:val="005B5104"/>
+    <w:rPr>
+      <w:b/>
+      <w:sz w:val="24"/>
+      <w:szCs w:val="24"/>
+      <w:lang w:val="en-US"/>
+    </w:rPr>
+  </w:style>
+  <w:style w:type="character" w:customStyle="1" w:styleId="TitleChar">
+    <w:name w:val="Title Char"/>
+    <w:basedOn w:val="DefaultParagraphFont"/>
+    <w:link w:val="Title"/>
+    <w:uiPriority w:val="10"/>
+    <w:rsid w:val="00B67468"/>
+    <w:rPr>
+      <w:b/>
+      <w:sz w:val="28"/>
+      <w:szCs w:val="28"/>
+      <w:lang w:val="en-US"/>
+    </w:rPr>
   </w:style>
 </w:styles>
 </file>
@@ -10345,6 +10454,31 @@
 </a:theme>
 </file>
 
+<file path=word/webextensions/taskpanes.xml><?xml version="1.0" encoding="utf-8"?>
+<wetp:taskpanes xmlns:wetp="http://schemas.microsoft.com/office/webextensions/taskpanes/2010/11">
+  <wetp:taskpane dockstate="right" visibility="0" width="438" row="0">
+    <wetp:webextensionref xmlns:r="http://schemas.openxmlformats.org/officeDocument/2006/relationships" r:id="rId1"/>
+  </wetp:taskpane>
+</wetp:taskpanes>
+</file>
+
+<file path=word/webextensions/webextension1.xml><?xml version="1.0" encoding="utf-8"?>
+<we:webextension xmlns:we="http://schemas.microsoft.com/office/webextensions/webextension/2010/11" id="{B712143F-12FD-4B21-B3B8-0A1F55E8CAB1}">
+  <we:reference id="wa104382081" version="1.55.1.0" store="en-US" storeType="OMEX"/>
+  <we:alternateReferences>
+    <we:reference id="WA104382081" version="1.55.1.0" store="" storeType="OMEX"/>
+  </we:alternateReferences>
+  <we:properties>
+    <we:property name="MENDELEY_BIBLIOGRAPHY_IS_DIRTY" value="true"/>
+    <we:property name="MENDELEY_BIBLIOGRAPHY_LAST_MODIFIED" value="1769665705175"/>
+    <we:property name="MENDELEY_CITATIONS" value="[]"/>
+    <we:property name="MENDELEY_CITATIONS_STYLE" value="{&quot;id&quot;:&quot;https://www.zotero.org/styles/apa&quot;,&quot;title&quot;:&quot;APA Style 7th edition&quot;,&quot;format&quot;:&quot;author-date&quot;,&quot;defaultLocale&quot;:null,&quot;isLocaleCodeValid&quot;:true}"/>
+  </we:properties>
+  <we:bindings/>
+  <we:snapshot xmlns:r="http://schemas.openxmlformats.org/officeDocument/2006/relationships"/>
+</we:webextension>
+</file>
+
 <file path=customXml/item1.xml><?xml version="1.0" encoding="utf-8"?>
 <go:gDocsCustomXmlDataStorage xmlns:go="http://customooxmlschemas.google.com/" xmlns:r="http://schemas.openxmlformats.org/officeDocument/2006/relationships" uri="GoogleDocsCustomDataVersion2">
   <go:docsCustomData xmlns:go="http://customooxmlschemas.google.com/" roundtripDataSignature="AMtx7mjoWQPQrC0Imd1FVNPs2OPpeIM0zw==">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</go:docsCustomData>

</xml_diff>